<commit_message>
docs: add live AWS deployment results and screenshots
Co-Authored-By: Claude Opus 5.5 <noreply@anthropic.com>
</commit_message>
<xml_diff>
--- a/docs/Project_Report.docx
+++ b/docs/Project_Report.docx
@@ -9216,13 +9216,433 @@
     </w:p>
     <w:p>
       <w:pPr>
+        <w:pStyle w:val="Heading2"/>
+      </w:pPr>
+      <w:r>
+        <w:t>Live AWS deployment</w:t>
+      </w:r>
+    </w:p>
+    <w:p>
+      <w:pPr>
+        <w:jc w:val="both"/>
+      </w:pPr>
+      <w:r>
+        <w:rPr>
+          <w:b w:val="0"/>
+          <w:i w:val="0"/>
+        </w:rPr>
+        <w:t>The stack was deployed with terraform apply to a Free-plan AWS account in ap-southeast-2 (Sydney) – 40 resources created in under two minutes. The account is region-locked by an AWS-managed organization policy, which is why Sydney rather than us-east-1 was used; the free tier is identical.</w:t>
+      </w:r>
+    </w:p>
+    <w:tbl>
+      <w:tblPr>
+        <w:tblStyle w:val="TableGrid"/>
+        <w:tblW w:type="auto" w:w="0"/>
+        <w:jc w:val="center"/>
+        <w:tblLook w:firstColumn="1" w:firstRow="1" w:lastColumn="0" w:lastRow="0" w:noHBand="0" w:noVBand="1" w:val="04A0"/>
+      </w:tblPr>
+      <w:tblGrid>
+        <w:gridCol w:w="4706"/>
+        <w:gridCol w:w="4706"/>
+      </w:tblGrid>
+      <w:tr>
+        <w:trPr>
+          <w:cantSplit/>
+          <w:tblHeader/>
+        </w:trPr>
+        <w:tc>
+          <w:tcPr>
+            <w:tcW w:type="dxa" w:w="3969"/>
+            <w:shd w:val="clear" w:color="auto" w:fill="1F3A5F"/>
+          </w:tcPr>
+          <w:p>
+            <w:r/>
+            <w:r>
+              <w:rPr>
+                <w:b/>
+                <w:color w:val="FFFFFF"/>
+                <w:sz w:val="18"/>
+              </w:rPr>
+              <w:t>Step on the real account</w:t>
+            </w:r>
+          </w:p>
+        </w:tc>
+        <w:tc>
+          <w:tcPr>
+            <w:tcW w:type="dxa" w:w="5386"/>
+            <w:shd w:val="clear" w:color="auto" w:fill="1F3A5F"/>
+          </w:tcPr>
+          <w:p>
+            <w:r/>
+            <w:r>
+              <w:rPr>
+                <w:b/>
+                <w:color w:val="FFFFFF"/>
+                <w:sz w:val="18"/>
+              </w:rPr>
+              <w:t>Observed result</w:t>
+            </w:r>
+          </w:p>
+        </w:tc>
+      </w:tr>
+      <w:tr>
+        <w:trPr>
+          <w:cantSplit/>
+        </w:trPr>
+        <w:tc>
+          <w:tcPr>
+            <w:tcW w:type="dxa" w:w="3969"/>
+          </w:tcPr>
+          <w:p>
+            <w:r/>
+            <w:r>
+              <w:rPr>
+                <w:sz w:val="18"/>
+              </w:rPr>
+              <w:t>First scan after deployment</w:t>
+            </w:r>
+          </w:p>
+        </w:tc>
+        <w:tc>
+          <w:tcPr>
+            <w:tcW w:type="dxa" w:w="5386"/>
+          </w:tcPr>
+          <w:p>
+            <w:r/>
+            <w:r>
+              <w:rPr>
+                <w:sz w:val="18"/>
+              </w:rPr>
+              <w:t>All 3 resources: no drift (no false positives; scan time 2.3 s)</w:t>
+            </w:r>
+          </w:p>
+        </w:tc>
+      </w:tr>
+      <w:tr>
+        <w:trPr>
+          <w:cantSplit/>
+        </w:trPr>
+        <w:tc>
+          <w:tcPr>
+            <w:tcW w:type="dxa" w:w="3969"/>
+            <w:shd w:val="clear" w:color="auto" w:fill="EEF3F8"/>
+          </w:tcPr>
+          <w:p>
+            <w:r/>
+            <w:r>
+              <w:rPr>
+                <w:sz w:val="18"/>
+              </w:rPr>
+              <w:t>Hourly EventBridge schedule</w:t>
+            </w:r>
+          </w:p>
+        </w:tc>
+        <w:tc>
+          <w:tcPr>
+            <w:tcW w:type="dxa" w:w="5386"/>
+            <w:shd w:val="clear" w:color="auto" w:fill="EEF3F8"/>
+          </w:tcPr>
+          <w:p>
+            <w:r/>
+            <w:r>
+              <w:rPr>
+                <w:sz w:val="18"/>
+              </w:rPr>
+              <w:t>Ran every hour with 0 Lambda errors and 0 throttles</w:t>
+            </w:r>
+          </w:p>
+        </w:tc>
+      </w:tr>
+      <w:tr>
+        <w:trPr>
+          <w:cantSplit/>
+        </w:trPr>
+        <w:tc>
+          <w:tcPr>
+            <w:tcW w:type="dxa" w:w="3969"/>
+          </w:tcPr>
+          <w:p>
+            <w:r/>
+            <w:r>
+              <w:rPr>
+                <w:sz w:val="18"/>
+              </w:rPr>
+              <w:t>SSH (22) opened to 0.0.0.0/0 in the EC2 console</w:t>
+            </w:r>
+          </w:p>
+        </w:tc>
+        <w:tc>
+          <w:tcPr>
+            <w:tcW w:type="dxa" w:w="5386"/>
+          </w:tcPr>
+          <w:p>
+            <w:r/>
+            <w:r>
+              <w:rPr>
+                <w:sz w:val="18"/>
+              </w:rPr>
+              <w:t>Next scan: Critical, change inbound_ssh.source_cidr 10.0.0.0/8 → 0.0.0.0/0</w:t>
+            </w:r>
+          </w:p>
+        </w:tc>
+      </w:tr>
+      <w:tr>
+        <w:trPr>
+          <w:cantSplit/>
+        </w:trPr>
+        <w:tc>
+          <w:tcPr>
+            <w:tcW w:type="dxa" w:w="3969"/>
+            <w:shd w:val="clear" w:color="auto" w:fill="EEF3F8"/>
+          </w:tcPr>
+          <w:p>
+            <w:r/>
+            <w:r>
+              <w:rPr>
+                <w:sz w:val="18"/>
+              </w:rPr>
+              <w:t>Alerting</w:t>
+            </w:r>
+          </w:p>
+        </w:tc>
+        <w:tc>
+          <w:tcPr>
+            <w:tcW w:type="dxa" w:w="5386"/>
+            <w:shd w:val="clear" w:color="auto" w:fill="EEF3F8"/>
+          </w:tcPr>
+          <w:p>
+            <w:r/>
+            <w:r>
+              <w:rPr>
+                <w:sz w:val="18"/>
+              </w:rPr>
+              <w:t>SNS e-mail alert + CloudWatch Critical-drift alarm: 3 notifications delivered, 0 failed</w:t>
+            </w:r>
+          </w:p>
+        </w:tc>
+      </w:tr>
+      <w:tr>
+        <w:trPr>
+          <w:cantSplit/>
+        </w:trPr>
+        <w:tc>
+          <w:tcPr>
+            <w:tcW w:type="dxa" w:w="3969"/>
+          </w:tcPr>
+          <w:p>
+            <w:r/>
+            <w:r>
+              <w:rPr>
+                <w:sz w:val="18"/>
+              </w:rPr>
+              <w:t>Rule removed in the console</w:t>
+            </w:r>
+          </w:p>
+        </w:tc>
+        <w:tc>
+          <w:tcPr>
+            <w:tcW w:type="dxa" w:w="5386"/>
+          </w:tcPr>
+          <w:p>
+            <w:r/>
+            <w:r>
+              <w:rPr>
+                <w:sz w:val="18"/>
+              </w:rPr>
+              <w:t>Next scan: no drift on all resources</w:t>
+            </w:r>
+          </w:p>
+        </w:tc>
+      </w:tr>
+      <w:tr>
+        <w:trPr>
+          <w:cantSplit/>
+        </w:trPr>
+        <w:tc>
+          <w:tcPr>
+            <w:tcW w:type="dxa" w:w="3969"/>
+            <w:shd w:val="clear" w:color="auto" w:fill="EEF3F8"/>
+          </w:tcPr>
+          <w:p>
+            <w:r/>
+            <w:r>
+              <w:rPr>
+                <w:sz w:val="18"/>
+              </w:rPr>
+              <w:t>terraform apply re-run while drift existed</w:t>
+            </w:r>
+          </w:p>
+        </w:tc>
+        <w:tc>
+          <w:tcPr>
+            <w:tcW w:type="dxa" w:w="5386"/>
+            <w:shd w:val="clear" w:color="auto" w:fill="EEF3F8"/>
+          </w:tcPr>
+          <w:p>
+            <w:r/>
+            <w:r>
+              <w:rPr>
+                <w:sz w:val="18"/>
+              </w:rPr>
+              <w:t>Terraform itself reverted the unmanaged SSH rule – the standard IaC way of correcting accepted drift</w:t>
+            </w:r>
+          </w:p>
+        </w:tc>
+      </w:tr>
+      <w:tr>
+        <w:trPr>
+          <w:cantSplit/>
+        </w:trPr>
+        <w:tc>
+          <w:tcPr>
+            <w:tcW w:type="dxa" w:w="3969"/>
+          </w:tcPr>
+          <w:p>
+            <w:r/>
+            <w:r>
+              <w:rPr>
+                <w:sz w:val="18"/>
+              </w:rPr>
+              <w:t>Dashboard access</w:t>
+            </w:r>
+          </w:p>
+        </w:tc>
+        <w:tc>
+          <w:tcPr>
+            <w:tcW w:type="dxa" w:w="5386"/>
+          </w:tcPr>
+          <w:p>
+            <w:r/>
+            <w:r>
+              <w:rPr>
+                <w:sz w:val="18"/>
+              </w:rPr>
+              <w:t>Cognito sign-in → API Gateway (JWT) → API Lambda → DynamoDB</w:t>
+            </w:r>
+          </w:p>
+        </w:tc>
+      </w:tr>
+    </w:tbl>
+    <w:p>
+      <w:pPr>
+        <w:spacing w:after="40"/>
+      </w:pPr>
+    </w:p>
+    <w:p>
+      <w:pPr>
+        <w:jc w:val="center"/>
+      </w:pPr>
+      <w:r>
+        <w:drawing>
+          <wp:inline xmlns:a="http://schemas.openxmlformats.org/drawingml/2006/main" xmlns:pic="http://schemas.openxmlformats.org/drawingml/2006/picture">
+            <wp:extent cx="5580000" cy="3450169"/>
+            <wp:docPr id="8" name="Picture 8"/>
+            <wp:cNvGraphicFramePr>
+              <a:graphicFrameLocks noChangeAspect="1"/>
+            </wp:cNvGraphicFramePr>
+            <a:graphic>
+              <a:graphicData uri="http://schemas.openxmlformats.org/drawingml/2006/picture">
+                <pic:pic>
+                  <pic:nvPicPr>
+                    <pic:cNvPr id="0" name="aws_live_critical_ssh_drift.png"/>
+                    <pic:cNvPicPr/>
+                  </pic:nvPicPr>
+                  <pic:blipFill>
+                    <a:blip r:embed="rId17"/>
+                    <a:stretch>
+                      <a:fillRect/>
+                    </a:stretch>
+                  </pic:blipFill>
+                  <pic:spPr>
+                    <a:xfrm>
+                      <a:off x="0" y="0"/>
+                      <a:ext cx="5580000" cy="3450169"/>
+                    </a:xfrm>
+                    <a:prstGeom prst="rect"/>
+                  </pic:spPr>
+                </pic:pic>
+              </a:graphicData>
+            </a:graphic>
+          </wp:inline>
+        </w:drawing>
+      </w:r>
+    </w:p>
+    <w:p>
+      <w:pPr>
+        <w:jc w:val="center"/>
+      </w:pPr>
+      <w:r>
+        <w:rPr>
+          <w:b w:val="0"/>
+          <w:i/>
+          <w:color w:val="555F6D"/>
+          <w:sz w:val="19"/>
+        </w:rPr>
+        <w:t>Figure 8. Live AWS: SSH opened to the internet detected as Critical.</w:t>
+      </w:r>
+    </w:p>
+    <w:p>
+      <w:pPr>
+        <w:jc w:val="center"/>
+      </w:pPr>
+      <w:r>
+        <w:drawing>
+          <wp:inline xmlns:a="http://schemas.openxmlformats.org/drawingml/2006/main" xmlns:pic="http://schemas.openxmlformats.org/drawingml/2006/picture">
+            <wp:extent cx="5580000" cy="1650423"/>
+            <wp:docPr id="9" name="Picture 9"/>
+            <wp:cNvGraphicFramePr>
+              <a:graphicFrameLocks noChangeAspect="1"/>
+            </wp:cNvGraphicFramePr>
+            <a:graphic>
+              <a:graphicData uri="http://schemas.openxmlformats.org/drawingml/2006/picture">
+                <pic:pic>
+                  <pic:nvPicPr>
+                    <pic:cNvPr id="0" name="aws_live_no_drift_after_fix.png"/>
+                    <pic:cNvPicPr/>
+                  </pic:nvPicPr>
+                  <pic:blipFill>
+                    <a:blip r:embed="rId18"/>
+                    <a:stretch>
+                      <a:fillRect/>
+                    </a:stretch>
+                  </pic:blipFill>
+                  <pic:spPr>
+                    <a:xfrm>
+                      <a:off x="0" y="0"/>
+                      <a:ext cx="5580000" cy="1650423"/>
+                    </a:xfrm>
+                    <a:prstGeom prst="rect"/>
+                  </pic:spPr>
+                </pic:pic>
+              </a:graphicData>
+            </a:graphic>
+          </wp:inline>
+        </w:drawing>
+      </w:r>
+    </w:p>
+    <w:p>
+      <w:pPr>
+        <w:jc w:val="center"/>
+      </w:pPr>
+      <w:r>
+        <w:rPr>
+          <w:b w:val="0"/>
+          <w:i/>
+          <w:color w:val="555F6D"/>
+          <w:sz w:val="19"/>
+        </w:rPr>
+        <w:t>Figure 9. Live AWS: after removing the rule, the next scan reports no drift.</w:t>
+      </w:r>
+    </w:p>
+    <w:p>
+      <w:pPr>
         <w:jc w:val="center"/>
       </w:pPr>
       <w:r>
         <w:drawing>
           <wp:inline xmlns:a="http://schemas.openxmlformats.org/drawingml/2006/main" xmlns:pic="http://schemas.openxmlformats.org/drawingml/2006/picture">
             <wp:extent cx="5040000" cy="2835000"/>
-            <wp:docPr id="8" name="Picture 8"/>
+            <wp:docPr id="10" name="Picture 10"/>
             <wp:cNvGraphicFramePr>
               <a:graphicFrameLocks noChangeAspect="1"/>
             </wp:cNvGraphicFramePr>
@@ -9234,7 +9654,7 @@
                     <pic:cNvPicPr/>
                   </pic:nvPicPr>
                   <pic:blipFill>
-                    <a:blip r:embed="rId17"/>
+                    <a:blip r:embed="rId19"/>
                     <a:stretch>
                       <a:fillRect/>
                     </a:stretch>
@@ -9264,7 +9684,7 @@
           <w:color w:val="555F6D"/>
           <w:sz w:val="19"/>
         </w:rPr>
-        <w:t>Figure 8. Streamlit dashboard – scenario S1 input.</w:t>
+        <w:t>Figure 10. Offline drift analyzer – scenario S1 input.</w:t>
       </w:r>
     </w:p>
     <w:p>
@@ -9275,7 +9695,7 @@
         <w:drawing>
           <wp:inline xmlns:a="http://schemas.openxmlformats.org/drawingml/2006/main" xmlns:pic="http://schemas.openxmlformats.org/drawingml/2006/picture">
             <wp:extent cx="5040000" cy="2835000"/>
-            <wp:docPr id="9" name="Picture 9"/>
+            <wp:docPr id="11" name="Picture 11"/>
             <wp:cNvGraphicFramePr>
               <a:graphicFrameLocks noChangeAspect="1"/>
             </wp:cNvGraphicFramePr>
@@ -9287,7 +9707,7 @@
                     <pic:cNvPicPr/>
                   </pic:nvPicPr>
                   <pic:blipFill>
-                    <a:blip r:embed="rId18"/>
+                    <a:blip r:embed="rId20"/>
                     <a:stretch>
                       <a:fillRect/>
                     </a:stretch>
@@ -9317,7 +9737,7 @@
           <w:color w:val="555F6D"/>
           <w:sz w:val="19"/>
         </w:rPr>
-        <w:t>Figure 9. Dashboard prediction: Critical.</w:t>
+        <w:t>Figure 11. Offline analyzer prediction: Critical.</w:t>
       </w:r>
     </w:p>
     <w:p>
@@ -9346,7 +9766,7 @@
         <w:pStyle w:val="ListNumber"/>
       </w:pPr>
       <w:r>
-        <w:t>Install Terraform ≥ 1.5 and the AWS CLI; run aws configure.</w:t>
+        <w:t>Install Terraform ≥ 1.5 and the AWS CLI; run aws configure (region ap-southeast-2 for our Free-plan account).</w:t>
       </w:r>
     </w:p>
     <w:p>

</xml_diff>